<commit_message>
Add repository link to lab 4 report
</commit_message>
<xml_diff>
--- a/report/АБс-426_Терещенко Н.С._ЛР4.docx
+++ b/report/АБс-426_Терещенко Н.С._ЛР4.docx
@@ -494,7 +494,7 @@
         <w:rPr>
           <w:noProof/>
         </w:rPr>
-        <w:instrText xml:space="preserve"> PAGEREF _Toc238207231 \h </w:instrText>
+        <w:instrText xml:space="preserve"> PAGEREF _Toc238207475 \h </w:instrText>
       </w:r>
       <w:r>
         <w:rPr>
@@ -557,7 +557,7 @@
         <w:rPr>
           <w:noProof/>
         </w:rPr>
-        <w:instrText xml:space="preserve"> PAGEREF _Toc238207232 \h </w:instrText>
+        <w:instrText xml:space="preserve"> PAGEREF _Toc238207476 \h </w:instrText>
       </w:r>
       <w:r>
         <w:rPr>
@@ -619,7 +619,7 @@
         <w:rPr>
           <w:noProof/>
         </w:rPr>
-        <w:instrText xml:space="preserve"> PAGEREF _Toc238207233 \h </w:instrText>
+        <w:instrText xml:space="preserve"> PAGEREF _Toc238207477 \h </w:instrText>
       </w:r>
       <w:r>
         <w:rPr>
@@ -682,7 +682,7 @@
         <w:rPr>
           <w:noProof/>
         </w:rPr>
-        <w:instrText xml:space="preserve"> PAGEREF _Toc238207234 \h </w:instrText>
+        <w:instrText xml:space="preserve"> PAGEREF _Toc238207478 \h </w:instrText>
       </w:r>
       <w:r>
         <w:rPr>
@@ -745,7 +745,7 @@
         <w:rPr>
           <w:noProof/>
         </w:rPr>
-        <w:instrText xml:space="preserve"> PAGEREF _Toc238207235 \h </w:instrText>
+        <w:instrText xml:space="preserve"> PAGEREF _Toc238207479 \h </w:instrText>
       </w:r>
       <w:r>
         <w:rPr>
@@ -808,7 +808,7 @@
         <w:rPr>
           <w:noProof/>
         </w:rPr>
-        <w:instrText xml:space="preserve"> PAGEREF _Toc238207236 \h </w:instrText>
+        <w:instrText xml:space="preserve"> PAGEREF _Toc238207480 \h </w:instrText>
       </w:r>
       <w:r>
         <w:rPr>
@@ -871,7 +871,7 @@
         <w:rPr>
           <w:noProof/>
         </w:rPr>
-        <w:instrText xml:space="preserve"> PAGEREF _Toc238207237 \h </w:instrText>
+        <w:instrText xml:space="preserve"> PAGEREF _Toc238207481 \h </w:instrText>
       </w:r>
       <w:r>
         <w:rPr>
@@ -934,7 +934,7 @@
         <w:rPr>
           <w:noProof/>
         </w:rPr>
-        <w:instrText xml:space="preserve"> PAGEREF _Toc238207238 \h </w:instrText>
+        <w:instrText xml:space="preserve"> PAGEREF _Toc238207482 \h </w:instrText>
       </w:r>
       <w:r>
         <w:rPr>
@@ -997,7 +997,7 @@
         <w:rPr>
           <w:noProof/>
         </w:rPr>
-        <w:instrText xml:space="preserve"> PAGEREF _Toc238207239 \h </w:instrText>
+        <w:instrText xml:space="preserve"> PAGEREF _Toc238207483 \h </w:instrText>
       </w:r>
       <w:r>
         <w:rPr>
@@ -1059,7 +1059,7 @@
         <w:rPr>
           <w:noProof/>
         </w:rPr>
-        <w:instrText xml:space="preserve"> PAGEREF _Toc238207240 \h </w:instrText>
+        <w:instrText xml:space="preserve"> PAGEREF _Toc238207484 \h </w:instrText>
       </w:r>
       <w:r>
         <w:rPr>
@@ -1121,7 +1121,7 @@
         <w:rPr>
           <w:noProof/>
         </w:rPr>
-        <w:instrText xml:space="preserve"> PAGEREF _Toc238207241 \h </w:instrText>
+        <w:instrText xml:space="preserve"> PAGEREF _Toc238207485 \h </w:instrText>
       </w:r>
       <w:r>
         <w:rPr>
@@ -1183,7 +1183,7 @@
         <w:rPr>
           <w:noProof/>
         </w:rPr>
-        <w:instrText xml:space="preserve"> PAGEREF _Toc238207242 \h </w:instrText>
+        <w:instrText xml:space="preserve"> PAGEREF _Toc238207486 \h </w:instrText>
       </w:r>
       <w:r>
         <w:rPr>
@@ -1246,7 +1246,7 @@
         <w:rPr>
           <w:noProof/>
         </w:rPr>
-        <w:instrText xml:space="preserve"> PAGEREF _Toc238207243 \h </w:instrText>
+        <w:instrText xml:space="preserve"> PAGEREF _Toc238207487 \h </w:instrText>
       </w:r>
       <w:r>
         <w:rPr>
@@ -1309,7 +1309,7 @@
         <w:rPr>
           <w:noProof/>
         </w:rPr>
-        <w:instrText xml:space="preserve"> PAGEREF _Toc238207244 \h </w:instrText>
+        <w:instrText xml:space="preserve"> PAGEREF _Toc238207488 \h </w:instrText>
       </w:r>
       <w:r>
         <w:rPr>
@@ -1372,7 +1372,7 @@
         <w:rPr>
           <w:noProof/>
         </w:rPr>
-        <w:instrText xml:space="preserve"> PAGEREF _Toc238207245 \h </w:instrText>
+        <w:instrText xml:space="preserve"> PAGEREF _Toc238207489 \h </w:instrText>
       </w:r>
       <w:r>
         <w:rPr>
@@ -1437,7 +1437,7 @@
           <w:sz w:val="28"/>
         </w:rPr>
       </w:pPr>
-      <w:bookmarkStart w:id="0" w:name="_Toc238207231"/>
+      <w:bookmarkStart w:id="0" w:name="_Toc238207475"/>
       <w:r>
         <w:rPr>
           <w:rFonts w:cs="Times New Roman"/>
@@ -1468,7 +1468,7 @@
           <w:b/>
         </w:rPr>
       </w:pPr>
-      <w:bookmarkStart w:id="1" w:name="_Toc238207232"/>
+      <w:bookmarkStart w:id="1" w:name="_Toc238207476"/>
       <w:r>
         <w:rPr>
           <w:rFonts w:cs="Times New Roman"/>
@@ -1542,7 +1542,7 @@
           <w:sz w:val="28"/>
         </w:rPr>
       </w:pPr>
-      <w:bookmarkStart w:id="2" w:name="_Toc238207233"/>
+      <w:bookmarkStart w:id="2" w:name="_Toc238207477"/>
       <w:r>
         <w:rPr>
           <w:rFonts w:cs="Times New Roman"/>
@@ -1562,7 +1562,7 @@
           <w:b/>
         </w:rPr>
       </w:pPr>
-      <w:bookmarkStart w:id="3" w:name="_Toc238207234"/>
+      <w:bookmarkStart w:id="3" w:name="_Toc238207478"/>
       <w:r>
         <w:rPr>
           <w:rFonts w:cs="Times New Roman"/>
@@ -1843,7 +1843,7 @@
           <w:b/>
         </w:rPr>
       </w:pPr>
-      <w:bookmarkStart w:id="4" w:name="_Toc238207235"/>
+      <w:bookmarkStart w:id="4" w:name="_Toc238207479"/>
       <w:r>
         <w:rPr>
           <w:rFonts w:cs="Times New Roman"/>
@@ -2618,7 +2618,7 @@
           <w:b/>
         </w:rPr>
       </w:pPr>
-      <w:bookmarkStart w:id="5" w:name="_Toc238207236"/>
+      <w:bookmarkStart w:id="5" w:name="_Toc238207480"/>
       <w:r>
         <w:rPr>
           <w:rFonts w:cs="Times New Roman"/>
@@ -2661,7 +2661,7 @@
           <w:sz w:val="24"/>
         </w:rPr>
         <w:drawing>
-          <wp:inline distT="0" distB="0" distL="0" distR="0" wp14:anchorId="1667C2A2" wp14:editId="16E2BA49">
+          <wp:inline distT="0" distB="0" distL="0" distR="0" wp14:anchorId="6F58A6DB" wp14:editId="3E87A9E2">
             <wp:extent cx="5461000" cy="3792637"/>
             <wp:effectExtent l="0" t="0" r="6350" b="0"/>
             <wp:docPr id="2" name="Рисунок 2"/>
@@ -2740,7 +2740,7 @@
         </w:rPr>
         <w:lastRenderedPageBreak/>
         <w:drawing>
-          <wp:inline distT="0" distB="0" distL="0" distR="0" wp14:anchorId="541ED91D" wp14:editId="1A67B04A">
+          <wp:inline distT="0" distB="0" distL="0" distR="0" wp14:anchorId="43892E43" wp14:editId="6FEBA78C">
             <wp:extent cx="5461000" cy="3792637"/>
             <wp:effectExtent l="0" t="0" r="6350" b="0"/>
             <wp:docPr id="3" name="Рисунок 3"/>
@@ -2818,7 +2818,7 @@
           <w:sz w:val="24"/>
         </w:rPr>
         <w:drawing>
-          <wp:inline distT="0" distB="0" distL="0" distR="0" wp14:anchorId="400B9D2C" wp14:editId="12F349EC">
+          <wp:inline distT="0" distB="0" distL="0" distR="0" wp14:anchorId="3E57F6C9" wp14:editId="59FD928A">
             <wp:extent cx="5461000" cy="3792637"/>
             <wp:effectExtent l="0" t="0" r="6350" b="0"/>
             <wp:docPr id="4" name="Рисунок 4"/>
@@ -2883,7 +2883,7 @@
           <w:b/>
         </w:rPr>
       </w:pPr>
-      <w:bookmarkStart w:id="6" w:name="_Toc238207237"/>
+      <w:bookmarkStart w:id="6" w:name="_Toc238207481"/>
       <w:r>
         <w:rPr>
           <w:rFonts w:cs="Times New Roman"/>
@@ -2927,7 +2927,7 @@
           <w:sz w:val="24"/>
         </w:rPr>
         <w:drawing>
-          <wp:inline distT="0" distB="0" distL="0" distR="0" wp14:anchorId="24B7080A" wp14:editId="71BDA1C0">
+          <wp:inline distT="0" distB="0" distL="0" distR="0" wp14:anchorId="5E5AB997" wp14:editId="7230ECE9">
             <wp:extent cx="5461000" cy="3792637"/>
             <wp:effectExtent l="0" t="0" r="6350" b="0"/>
             <wp:docPr id="5" name="Рисунок 5"/>
@@ -3006,7 +3006,7 @@
         </w:rPr>
         <w:lastRenderedPageBreak/>
         <w:drawing>
-          <wp:inline distT="0" distB="0" distL="0" distR="0" wp14:anchorId="0BF9D301" wp14:editId="65867183">
+          <wp:inline distT="0" distB="0" distL="0" distR="0" wp14:anchorId="7FBA271C" wp14:editId="362630F5">
             <wp:extent cx="5461000" cy="3959006"/>
             <wp:effectExtent l="0" t="0" r="6350" b="3810"/>
             <wp:docPr id="6" name="Рисунок 6"/>
@@ -3084,7 +3084,7 @@
           <w:sz w:val="24"/>
         </w:rPr>
         <w:drawing>
-          <wp:inline distT="0" distB="0" distL="0" distR="0" wp14:anchorId="61394D81" wp14:editId="36B554E4">
+          <wp:inline distT="0" distB="0" distL="0" distR="0" wp14:anchorId="66232009" wp14:editId="0A1A8327">
             <wp:extent cx="5461000" cy="3792637"/>
             <wp:effectExtent l="0" t="0" r="6350" b="0"/>
             <wp:docPr id="7" name="Рисунок 7"/>
@@ -3149,7 +3149,7 @@
           <w:b/>
         </w:rPr>
       </w:pPr>
-      <w:bookmarkStart w:id="7" w:name="_Toc238207238"/>
+      <w:bookmarkStart w:id="7" w:name="_Toc238207482"/>
       <w:r>
         <w:rPr>
           <w:rFonts w:cs="Times New Roman"/>
@@ -3180,7 +3180,7 @@
           <w:b/>
         </w:rPr>
       </w:pPr>
-      <w:bookmarkStart w:id="8" w:name="_Toc238207239"/>
+      <w:bookmarkStart w:id="8" w:name="_Toc238207483"/>
       <w:r>
         <w:rPr>
           <w:rFonts w:cs="Times New Roman"/>
@@ -3197,7 +3197,7 @@
         <w:jc w:val="both"/>
       </w:pPr>
       <w:r>
-        <w:t>Frontend успешно собран. Smoke-тест на http://m4nuul.ru:5054 подтвердил вход двух ролей, запрет поддельной роли и admin-действия оператором, CRUD, изменение статуса, удаление и пагинацию. PostgreSQL tipm_lab4 изолирована от других работ.</w:t>
+        <w:t>Frontend успешно собран. Smoke-тест на http://m4nuul.ru:5054 подтвердил вход двух ролей, запрет поддельной роли и admin-действия оператором, CRUD, изменение статуса, удаление и пагинацию. PostgreSQL tipm_lab4 изолирована от других работ. Исходный код: https://github.com/M4NUUL/laboratorywork4/tree/ready-variant-21.</w:t>
       </w:r>
     </w:p>
     <w:p>
@@ -3210,7 +3210,7 @@
           <w:sz w:val="28"/>
         </w:rPr>
       </w:pPr>
-      <w:bookmarkStart w:id="9" w:name="_Toc238207240"/>
+      <w:bookmarkStart w:id="9" w:name="_Toc238207484"/>
       <w:r>
         <w:rPr>
           <w:rFonts w:cs="Times New Roman"/>
@@ -3481,7 +3481,7 @@
           <w:sz w:val="28"/>
         </w:rPr>
       </w:pPr>
-      <w:bookmarkStart w:id="10" w:name="_Toc238207241"/>
+      <w:bookmarkStart w:id="10" w:name="_Toc238207485"/>
       <w:r>
         <w:rPr>
           <w:rFonts w:cs="Times New Roman"/>
@@ -3519,7 +3519,7 @@
           <w:sz w:val="28"/>
         </w:rPr>
       </w:pPr>
-      <w:bookmarkStart w:id="11" w:name="_Toc238207242"/>
+      <w:bookmarkStart w:id="11" w:name="_Toc238207486"/>
       <w:r>
         <w:rPr>
           <w:rFonts w:cs="Times New Roman"/>
@@ -3540,7 +3540,7 @@
           <w:b/>
         </w:rPr>
       </w:pPr>
-      <w:bookmarkStart w:id="12" w:name="_Toc238207243"/>
+      <w:bookmarkStart w:id="12" w:name="_Toc238207487"/>
       <w:r>
         <w:rPr>
           <w:rFonts w:cs="Times New Roman"/>
@@ -3793,7 +3793,7 @@
           <w:b/>
         </w:rPr>
       </w:pPr>
-      <w:bookmarkStart w:id="13" w:name="_Toc238207244"/>
+      <w:bookmarkStart w:id="13" w:name="_Toc238207488"/>
       <w:r>
         <w:rPr>
           <w:rFonts w:cs="Times New Roman"/>
@@ -3930,7 +3930,7 @@
           <w:b/>
         </w:rPr>
       </w:pPr>
-      <w:bookmarkStart w:id="14" w:name="_Toc238207245"/>
+      <w:bookmarkStart w:id="14" w:name="_Toc238207489"/>
       <w:r>
         <w:rPr>
           <w:rFonts w:cs="Times New Roman"/>
@@ -4306,7 +4306,7 @@
 <file path=word/numbering.xml><?xml version="1.0" encoding="utf-8"?>
 <w:numbering xmlns:wpc="http://schemas.microsoft.com/office/word/2010/wordprocessingCanvas" xmlns:cx="http://schemas.microsoft.com/office/drawing/2014/chartex" xmlns:cx1="http://schemas.microsoft.com/office/drawing/2015/9/8/chartex" xmlns:cx2="http://schemas.microsoft.com/office/drawing/2015/10/21/chartex" xmlns:cx3="http://schemas.microsoft.com/office/drawing/2016/5/9/chartex" xmlns:cx4="http://schemas.microsoft.com/office/drawing/2016/5/10/chartex" xmlns:cx5="http://schemas.microsoft.com/office/drawing/2016/5/11/chartex" xmlns:cx6="http://schemas.microsoft.com/office/drawing/2016/5/12/chartex" xmlns:cx7="http://schemas.microsoft.com/office/drawing/2016/5/13/chartex" xmlns:cx8="http://schemas.microsoft.com/office/drawing/2016/5/14/chartex" xmlns:mc="http://schemas.openxmlformats.org/markup-compatibility/2006" xmlns:aink="http://schemas.microsoft.com/office/drawing/2016/ink" xmlns:am3d="http://schemas.microsoft.com/office/drawing/2017/model3d" xmlns:o="urn:schemas-microsoft-com:office:office" xmlns:oel="http://schemas.microsoft.com/office/2019/extlst" xmlns:r="http://schemas.openxmlformats.org/officeDocument/2006/relationships" xmlns:m="http://schemas.openxmlformats.org/officeDocument/2006/math" xmlns:v="urn:schemas-microsoft-com:vml" xmlns:wp14="http://schemas.microsoft.com/office/word/2010/wordprocessingDrawing" xmlns:wp="http://schemas.openxmlformats.org/drawingml/2006/wordprocessingDrawing" xmlns:w10="urn:schemas-microsoft-com:office:word" xmlns:w="http://schemas.openxmlformats.org/wordprocessingml/2006/main" xmlns:w14="http://schemas.microsoft.com/office/word/2010/wordml" xmlns:w15="http://schemas.microsoft.com/office/word/2012/wordml" xmlns:w16cex="http://schemas.microsoft.com/office/word/2018/wordml/cex" xmlns:w16cid="http://schemas.microsoft.com/office/word/2016/wordml/cid" xmlns:w16="http://schemas.microsoft.com/office/word/2018/wordml" xmlns:w16sdtdh="http://schemas.microsoft.com/office/word/2020/wordml/sdtdatahash" xmlns:w16se="http://schemas.microsoft.com/office/word/2015/wordml/symex" xmlns:wpg="http://schemas.microsoft.com/office/word/2010/wordprocessingGroup" xmlns:wpi="http://schemas.microsoft.com/office/word/2010/wordprocessingInk" xmlns:wne="http://schemas.microsoft.com/office/word/2006/wordml" xmlns:wps="http://schemas.microsoft.com/office/word/2010/wordprocessingShape" mc:Ignorable="w14 w15 w16se w16cid w16 w16cex w16sdtdh wp14">
   <w:abstractNum w:abstractNumId="0" w15:restartNumberingAfterBreak="0">
-    <w:nsid w:val="167D7BEA"/>
+    <w:nsid w:val="3A796802"/>
     <w:multiLevelType w:val="singleLevel"/>
     <w:tmpl w:val="04190001"/>
     <w:lvl w:ilvl="0">
@@ -4323,23 +4323,6 @@
     </w:lvl>
   </w:abstractNum>
   <w:abstractNum w:abstractNumId="1" w15:restartNumberingAfterBreak="0">
-    <w:nsid w:val="1D1A1A36"/>
-    <w:multiLevelType w:val="singleLevel"/>
-    <w:tmpl w:val="04190001"/>
-    <w:lvl w:ilvl="0">
-      <w:start w:val="1"/>
-      <w:numFmt w:val="bullet"/>
-      <w:lvlText w:val=""/>
-      <w:lvlJc w:val="left"/>
-      <w:pPr>
-        <w:ind w:left="720" w:hanging="360"/>
-      </w:pPr>
-      <w:rPr>
-        <w:rFonts w:ascii="Symbol" w:hAnsi="Symbol" w:hint="default"/>
-      </w:rPr>
-    </w:lvl>
-  </w:abstractNum>
-  <w:abstractNum w:abstractNumId="2" w15:restartNumberingAfterBreak="0">
     <w:nsid w:val="3AC60348"/>
     <w:multiLevelType w:val="hybridMultilevel"/>
     <w:tmpl w:val="6ABC4AC6"/>
@@ -4428,24 +4411,7 @@
       </w:pPr>
     </w:lvl>
   </w:abstractNum>
-  <w:abstractNum w:abstractNumId="3" w15:restartNumberingAfterBreak="0">
-    <w:nsid w:val="43D33555"/>
-    <w:multiLevelType w:val="singleLevel"/>
-    <w:tmpl w:val="04190001"/>
-    <w:lvl w:ilvl="0">
-      <w:start w:val="1"/>
-      <w:numFmt w:val="bullet"/>
-      <w:lvlText w:val=""/>
-      <w:lvlJc w:val="left"/>
-      <w:pPr>
-        <w:ind w:left="720" w:hanging="360"/>
-      </w:pPr>
-      <w:rPr>
-        <w:rFonts w:ascii="Symbol" w:hAnsi="Symbol" w:hint="default"/>
-      </w:rPr>
-    </w:lvl>
-  </w:abstractNum>
-  <w:abstractNum w:abstractNumId="4" w15:restartNumberingAfterBreak="0">
+  <w:abstractNum w:abstractNumId="2" w15:restartNumberingAfterBreak="0">
     <w:nsid w:val="48BB6658"/>
     <w:multiLevelType w:val="hybridMultilevel"/>
     <w:tmpl w:val="31C2594A"/>
@@ -4531,7 +4497,7 @@
       </w:pPr>
     </w:lvl>
   </w:abstractNum>
-  <w:abstractNum w:abstractNumId="5" w15:restartNumberingAfterBreak="0">
+  <w:abstractNum w:abstractNumId="3" w15:restartNumberingAfterBreak="0">
     <w:nsid w:val="496A31CF"/>
     <w:multiLevelType w:val="hybridMultilevel"/>
     <w:tmpl w:val="3CB2E968"/>
@@ -4617,8 +4583,8 @@
       </w:pPr>
     </w:lvl>
   </w:abstractNum>
-  <w:abstractNum w:abstractNumId="6" w15:restartNumberingAfterBreak="0">
-    <w:nsid w:val="502A2D04"/>
+  <w:abstractNum w:abstractNumId="4" w15:restartNumberingAfterBreak="0">
+    <w:nsid w:val="54870B37"/>
     <w:multiLevelType w:val="singleLevel"/>
     <w:tmpl w:val="04190001"/>
     <w:lvl w:ilvl="0">
@@ -4634,8 +4600,8 @@
       </w:rPr>
     </w:lvl>
   </w:abstractNum>
-  <w:abstractNum w:abstractNumId="7" w15:restartNumberingAfterBreak="0">
-    <w:nsid w:val="584048DD"/>
+  <w:abstractNum w:abstractNumId="5" w15:restartNumberingAfterBreak="0">
+    <w:nsid w:val="580178F2"/>
     <w:multiLevelType w:val="singleLevel"/>
     <w:tmpl w:val="04190001"/>
     <w:lvl w:ilvl="0">
@@ -4651,7 +4617,7 @@
       </w:rPr>
     </w:lvl>
   </w:abstractNum>
-  <w:abstractNum w:abstractNumId="8" w15:restartNumberingAfterBreak="0">
+  <w:abstractNum w:abstractNumId="6" w15:restartNumberingAfterBreak="0">
     <w:nsid w:val="5E0A6E10"/>
     <w:multiLevelType w:val="hybridMultilevel"/>
     <w:tmpl w:val="304089FA"/>
@@ -4737,7 +4703,7 @@
       </w:pPr>
     </w:lvl>
   </w:abstractNum>
-  <w:abstractNum w:abstractNumId="9" w15:restartNumberingAfterBreak="0">
+  <w:abstractNum w:abstractNumId="7" w15:restartNumberingAfterBreak="0">
     <w:nsid w:val="70DE3D91"/>
     <w:multiLevelType w:val="hybridMultilevel"/>
     <w:tmpl w:val="25F0F49C"/>
@@ -4823,8 +4789,8 @@
       </w:pPr>
     </w:lvl>
   </w:abstractNum>
-  <w:abstractNum w:abstractNumId="10" w15:restartNumberingAfterBreak="0">
-    <w:nsid w:val="778154D7"/>
+  <w:abstractNum w:abstractNumId="8" w15:restartNumberingAfterBreak="0">
+    <w:nsid w:val="73317D57"/>
     <w:multiLevelType w:val="singleLevel"/>
     <w:tmpl w:val="04190001"/>
     <w:lvl w:ilvl="0">
@@ -4840,38 +4806,72 @@
       </w:rPr>
     </w:lvl>
   </w:abstractNum>
+  <w:abstractNum w:abstractNumId="9" w15:restartNumberingAfterBreak="0">
+    <w:nsid w:val="74966C9D"/>
+    <w:multiLevelType w:val="singleLevel"/>
+    <w:tmpl w:val="04190001"/>
+    <w:lvl w:ilvl="0">
+      <w:start w:val="1"/>
+      <w:numFmt w:val="bullet"/>
+      <w:lvlText w:val=""/>
+      <w:lvlJc w:val="left"/>
+      <w:pPr>
+        <w:ind w:left="720" w:hanging="360"/>
+      </w:pPr>
+      <w:rPr>
+        <w:rFonts w:ascii="Symbol" w:hAnsi="Symbol" w:hint="default"/>
+      </w:rPr>
+    </w:lvl>
+  </w:abstractNum>
+  <w:abstractNum w:abstractNumId="10" w15:restartNumberingAfterBreak="0">
+    <w:nsid w:val="750D548E"/>
+    <w:multiLevelType w:val="singleLevel"/>
+    <w:tmpl w:val="04190001"/>
+    <w:lvl w:ilvl="0">
+      <w:start w:val="1"/>
+      <w:numFmt w:val="bullet"/>
+      <w:lvlText w:val=""/>
+      <w:lvlJc w:val="left"/>
+      <w:pPr>
+        <w:ind w:left="720" w:hanging="360"/>
+      </w:pPr>
+      <w:rPr>
+        <w:rFonts w:ascii="Symbol" w:hAnsi="Symbol" w:hint="default"/>
+      </w:rPr>
+    </w:lvl>
+  </w:abstractNum>
   <w:num w:numId="1" w16cid:durableId="1042291471">
+    <w:abstractNumId w:val="7"/>
+  </w:num>
+  <w:num w:numId="2" w16cid:durableId="1578247069">
+    <w:abstractNumId w:val="2"/>
+  </w:num>
+  <w:num w:numId="3" w16cid:durableId="1464931985">
+    <w:abstractNumId w:val="6"/>
+  </w:num>
+  <w:num w:numId="4" w16cid:durableId="523983672">
+    <w:abstractNumId w:val="1"/>
+  </w:num>
+  <w:num w:numId="5" w16cid:durableId="530806510">
+    <w:abstractNumId w:val="3"/>
+  </w:num>
+  <w:num w:numId="6" w16cid:durableId="1225533415">
     <w:abstractNumId w:val="9"/>
   </w:num>
-  <w:num w:numId="2" w16cid:durableId="1578247069">
+  <w:num w:numId="7" w16cid:durableId="153643521">
+    <w:abstractNumId w:val="10"/>
+  </w:num>
+  <w:num w:numId="8" w16cid:durableId="715617680">
+    <w:abstractNumId w:val="8"/>
+  </w:num>
+  <w:num w:numId="9" w16cid:durableId="1357459400">
+    <w:abstractNumId w:val="0"/>
+  </w:num>
+  <w:num w:numId="10" w16cid:durableId="1563173127">
     <w:abstractNumId w:val="4"/>
   </w:num>
-  <w:num w:numId="3" w16cid:durableId="1464931985">
-    <w:abstractNumId w:val="8"/>
-  </w:num>
-  <w:num w:numId="4" w16cid:durableId="523983672">
-    <w:abstractNumId w:val="2"/>
-  </w:num>
-  <w:num w:numId="5" w16cid:durableId="530806510">
+  <w:num w:numId="11" w16cid:durableId="1146819219">
     <w:abstractNumId w:val="5"/>
-  </w:num>
-  <w:num w:numId="6" w16cid:durableId="1902523636">
-    <w:abstractNumId w:val="3"/>
-  </w:num>
-  <w:num w:numId="7" w16cid:durableId="950435388">
-    <w:abstractNumId w:val="0"/>
-  </w:num>
-  <w:num w:numId="8" w16cid:durableId="1519198375">
-    <w:abstractNumId w:val="6"/>
-  </w:num>
-  <w:num w:numId="9" w16cid:durableId="2125299125">
-    <w:abstractNumId w:val="7"/>
-  </w:num>
-  <w:num w:numId="10" w16cid:durableId="1260287564">
-    <w:abstractNumId w:val="1"/>
-  </w:num>
-  <w:num w:numId="11" w16cid:durableId="1206017596">
-    <w:abstractNumId w:val="10"/>
   </w:num>
   <w:numIdMacAtCleanup w:val="2"/>
 </w:numbering>

</xml_diff>